<commit_message>
chore: another resume update
</commit_message>
<xml_diff>
--- a/DSCMS/wwwroot/raw/resume/resume-brady-prigge.docx
+++ b/DSCMS/wwwroot/raw/resume/resume-brady-prigge.docx
@@ -473,6 +473,9 @@
               <w:t>Mackin</w:t>
             </w:r>
             <w:r>
+              <w:t xml:space="preserve"> Educational Resources</w:t>
+            </w:r>
+            <w:r>
               <w:t xml:space="preserve">. </w:t>
             </w:r>
             <w:r>
@@ -1353,10 +1356,28 @@
               <w:t xml:space="preserve"> a fully functional, fast, and simple CMS that</w:t>
             </w:r>
             <w:r>
-              <w:t xml:space="preserve"> supports multiple types of user-defined content.</w:t>
-            </w:r>
-            <w:r>
-              <w:t xml:space="preserve"> Developed personal </w:t>
+              <w:t xml:space="preserve"> supports multiple types of user-defined content</w:t>
+            </w:r>
+            <w:r>
+              <w:t>, layout</w:t>
+            </w:r>
+            <w:r>
+              <w:t>s</w:t>
+            </w:r>
+            <w:r>
+              <w:t xml:space="preserve"> and templates</w:t>
+            </w:r>
+            <w:r>
+              <w:t>.</w:t>
+            </w:r>
+            <w:r>
+              <w:t xml:space="preserve"> Developed</w:t>
+            </w:r>
+            <w:r>
+              <w:t xml:space="preserve"> and deployed</w:t>
+            </w:r>
+            <w:r>
+              <w:t xml:space="preserve"> personal </w:t>
             </w:r>
             <w:hyperlink r:id="rId13" w:history="1">
               <w:r>
@@ -1367,7 +1388,25 @@
               </w:r>
             </w:hyperlink>
             <w:r>
-              <w:t xml:space="preserve">, which utilizes DSCMS to deliver a hand-built, data-driven, fully admin-able website to store development projects as well as their source code. Built </w:t>
+              <w:t>, which utilizes DSCMS to deliver a data-driven, fully admin-able website to</w:t>
+            </w:r>
+            <w:r>
+              <w:t xml:space="preserve"> display and manage blog posts as well as </w:t>
+            </w:r>
+            <w:r>
+              <w:t>develop</w:t>
+            </w:r>
+            <w:r>
+              <w:t>ed</w:t>
+            </w:r>
+            <w:r>
+              <w:t xml:space="preserve"> projects</w:t>
+            </w:r>
+            <w:r>
+              <w:t xml:space="preserve"> and games</w:t>
+            </w:r>
+            <w:r>
+              <w:t xml:space="preserve">. Built </w:t>
             </w:r>
             <w:hyperlink r:id="rId14" w:history="1">
               <w:r>
@@ -1427,7 +1466,6 @@
               <w:spacing w:line="276" w:lineRule="auto"/>
             </w:pPr>
             <w:r>
-              <w:lastRenderedPageBreak/>
               <w:t xml:space="preserve">DSCMS </w:t>
             </w:r>
             <w:r>
@@ -1790,6 +1828,13 @@
               <w:t>Mackin</w:t>
             </w:r>
             <w:r>
+              <w:rPr>
+                <w:rFonts w:ascii="Bookman Old Style" w:eastAsia="Gill Sans MT" w:hAnsi="Bookman Old Style"/>
+                <w:color w:val="727CA3"/>
+              </w:rPr>
+              <w:t xml:space="preserve"> Educational Resources</w:t>
+            </w:r>
+            <w:r>
               <w:t xml:space="preserve"> (Burnsville, MN)</w:t>
             </w:r>
           </w:p>
@@ -2136,11 +2181,6 @@
             <w:r>
               <w:t>, Jasmine/Karma</w:t>
             </w:r>
-          </w:p>
-          <w:p>
-            <w:pPr>
-              <w:pStyle w:val="SubsectionText"/>
-            </w:pPr>
           </w:p>
           <w:p>
             <w:pPr>
@@ -6790,11 +6830,13 @@
     <w:rsid w:val="000D0905"/>
     <w:rsid w:val="000E7A2E"/>
     <w:rsid w:val="000F0C4D"/>
+    <w:rsid w:val="000F2BEE"/>
     <w:rsid w:val="000F6CC0"/>
     <w:rsid w:val="001544D0"/>
     <w:rsid w:val="00217F6C"/>
     <w:rsid w:val="00227834"/>
     <w:rsid w:val="00230AAD"/>
+    <w:rsid w:val="002351E9"/>
     <w:rsid w:val="00270F53"/>
     <w:rsid w:val="002750B7"/>
     <w:rsid w:val="00296CAB"/>
@@ -6807,6 +6849,7 @@
     <w:rsid w:val="003B1FA3"/>
     <w:rsid w:val="003E0193"/>
     <w:rsid w:val="004514A5"/>
+    <w:rsid w:val="00460E5F"/>
     <w:rsid w:val="004941C3"/>
     <w:rsid w:val="004B6867"/>
     <w:rsid w:val="004D045D"/>
@@ -6858,6 +6901,7 @@
     <w:rsid w:val="00AF0935"/>
     <w:rsid w:val="00AF0E75"/>
     <w:rsid w:val="00AF709E"/>
+    <w:rsid w:val="00B047FC"/>
     <w:rsid w:val="00B4030E"/>
     <w:rsid w:val="00B5725A"/>
     <w:rsid w:val="00B63F5E"/>

</xml_diff>